<commit_message>
Génération de tous les attestaoionss
</commit_message>
<xml_diff>
--- a/backend/templates/word/attestation_presence_template.docx
+++ b/backend/templates/word/attestation_presence_template.docx
@@ -884,20 +884,15 @@
         </w:rPr>
         <w:t xml:space="preserve"> {{DATE_AUJOURD_HUI}}</w:t>
       </w:r>
-      <w:r>
-        <w:rPr>
-          <w:rFonts w:ascii="Consolas" w:hAnsi="Consolas"/>
-          <w:color w:val="F9FAFB"/>
-        </w:rPr>
-        <w:t>_AUJOURD_HUI}}</w:t>
-      </w:r>
     </w:p>
     <w:p>
       <w:pPr>
-        <w:rPr>
-          <w:rFonts w:ascii="Trebuchet MS" w:hAnsi="Trebuchet MS"/>
-          <w:sz w:val="26"/>
-          <w:szCs w:val="26"/>
+        <w:pStyle w:val="PrformatHTML"/>
+        <w:wordWrap w:val="0"/>
+        <w:spacing w:line="330" w:lineRule="atLeast"/>
+        <w:rPr>
+          <w:rFonts w:ascii="Consolas" w:hAnsi="Consolas"/>
+          <w:color w:val="F9FAFB"/>
         </w:rPr>
       </w:pPr>
     </w:p>
@@ -978,6 +973,7 @@
           <w:szCs w:val="24"/>
         </w:rPr>
       </w:pPr>
+      <w:proofErr w:type="gramStart"/>
       <w:r>
         <w:rPr>
           <w:rFonts w:ascii="Trebuchet MS" w:hAnsi="Trebuchet MS"/>
@@ -985,18 +981,18 @@
           <w:sz w:val="24"/>
           <w:szCs w:val="24"/>
         </w:rPr>
-        <w:t xml:space="preserve">de l’Administration et des Finances </w:t>
-      </w:r>
-    </w:p>
-    <w:p>
-      <w:pPr>
-        <w:rPr>
-          <w:rFonts w:ascii="Rockwell" w:hAnsi="Rockwell"/>
-          <w:noProof/>
-          <w:sz w:val="26"/>
-          <w:szCs w:val="26"/>
-        </w:rPr>
-      </w:pPr>
+        <w:t>de</w:t>
+      </w:r>
+      <w:proofErr w:type="gramEnd"/>
+      <w:r>
+        <w:rPr>
+          <w:rFonts w:ascii="Trebuchet MS" w:hAnsi="Trebuchet MS"/>
+          <w:b/>
+          <w:sz w:val="24"/>
+          <w:szCs w:val="24"/>
+        </w:rPr>
+        <w:t xml:space="preserve"> l’Administration et des Finances </w:t>
+      </w:r>
     </w:p>
     <w:p>
       <w:pPr>
@@ -1417,27 +1413,6 @@
     </w:p>
     <w:p>
       <w:pPr>
-        <w:ind w:right="-337"/>
-        <w:rPr>
-          <w:rFonts w:ascii="Trebuchet MS" w:hAnsi="Trebuchet MS"/>
-          <w:sz w:val="28"/>
-          <w:szCs w:val="28"/>
-        </w:rPr>
-      </w:pPr>
-    </w:p>
-    <w:p>
-      <w:pPr>
-        <w:rPr>
-          <w:rFonts w:ascii="Trebuchet MS" w:hAnsi="Trebuchet MS" w:cs="Arial"/>
-          <w:b/>
-          <w:noProof/>
-          <w:sz w:val="26"/>
-          <w:szCs w:val="26"/>
-        </w:rPr>
-      </w:pPr>
-    </w:p>
-    <w:p>
-      <w:pPr>
         <w:pStyle w:val="Retraitcorpsdetexte31"/>
         <w:tabs>
           <w:tab w:val="left" w:pos="5103"/>
@@ -1454,69 +1429,47 @@
           <w:rFonts w:ascii="Trebuchet MS" w:hAnsi="Trebuchet MS"/>
           <w:b/>
         </w:rPr>
-        <w:t>Augustine Tognissè CAKPO SOGLO</w:t>
+        <w:t xml:space="preserve">Augustine </w:t>
+      </w:r>
+      <w:proofErr w:type="spellStart"/>
+      <w:r>
+        <w:rPr>
+          <w:rFonts w:ascii="Trebuchet MS" w:hAnsi="Trebuchet MS"/>
+          <w:b/>
+        </w:rPr>
+        <w:t>Tognissè</w:t>
+      </w:r>
+      <w:proofErr w:type="spellEnd"/>
+      <w:r>
+        <w:rPr>
+          <w:rFonts w:ascii="Trebuchet MS" w:hAnsi="Trebuchet MS"/>
+          <w:b/>
+        </w:rPr>
+        <w:t xml:space="preserve"> CAKPO SOGLO</w:t>
       </w:r>
     </w:p>
     <w:p>
       <w:pPr>
         <w:rPr>
-          <w:rFonts w:ascii="Trebuchet MS" w:hAnsi="Trebuchet MS"/>
-          <w:sz w:val="26"/>
-          <w:szCs w:val="26"/>
-        </w:rPr>
-      </w:pPr>
-    </w:p>
-    <w:p>
-      <w:pPr>
-        <w:rPr>
           <w:rFonts w:ascii="Rockwell" w:hAnsi="Rockwell"/>
           <w:noProof/>
         </w:rPr>
       </w:pPr>
-    </w:p>
-    <w:p>
-      <w:pPr>
-        <w:tabs>
-          <w:tab w:val="left" w:pos="8505"/>
-        </w:tabs>
-        <w:rPr>
-          <w:rFonts w:ascii="Rockwell" w:hAnsi="Rockwell"/>
+      <w:r>
+        <w:rPr>
           <w:noProof/>
         </w:rPr>
-      </w:pPr>
-    </w:p>
-    <w:p>
-      <w:pPr>
-        <w:rPr>
-          <w:rFonts w:ascii="Rockwell" w:hAnsi="Rockwell"/>
-          <w:noProof/>
-        </w:rPr>
-      </w:pPr>
-    </w:p>
-    <w:p>
-      <w:pPr>
-        <w:rPr>
-          <w:rFonts w:ascii="Rockwell" w:hAnsi="Rockwell"/>
-          <w:noProof/>
-        </w:rPr>
-      </w:pPr>
-    </w:p>
-    <w:p>
-      <w:r>
-        <w:rPr>
-          <w:noProof/>
-        </w:rPr>
         <w:drawing>
-          <wp:anchor distT="0" distB="0" distL="114300" distR="114300" simplePos="0" relativeHeight="251662336" behindDoc="0" locked="0" layoutInCell="1" allowOverlap="1" wp14:anchorId="16AA6F67" wp14:editId="02482EFA">
+          <wp:anchor distT="0" distB="0" distL="114300" distR="114300" simplePos="0" relativeHeight="251662336" behindDoc="0" locked="0" layoutInCell="1" allowOverlap="1" wp14:anchorId="16AA6F67" wp14:editId="56F7D421">
             <wp:simplePos x="0" y="0"/>
-            <wp:positionH relativeFrom="column">
-              <wp:posOffset>1654810</wp:posOffset>
+            <wp:positionH relativeFrom="margin">
+              <wp:posOffset>1838960</wp:posOffset>
             </wp:positionH>
             <wp:positionV relativeFrom="paragraph">
-              <wp:posOffset>233680</wp:posOffset>
+              <wp:posOffset>677545</wp:posOffset>
             </wp:positionV>
             <wp:extent cx="2817883" cy="130629"/>
-            <wp:effectExtent l="19050" t="0" r="1517" b="0"/>
+            <wp:effectExtent l="0" t="0" r="0" b="3175"/>
             <wp:wrapNone/>
             <wp:docPr id="9" name="Image 13" descr="Bande MENC"/>
             <wp:cNvGraphicFramePr>
@@ -1555,7 +1508,6 @@
         </w:drawing>
       </w:r>
     </w:p>
-    <w:p/>
     <w:sectPr>
       <w:pgSz w:w="11906" w:h="16838"/>
       <w:pgMar w:top="357" w:right="1134" w:bottom="284" w:left="1134" w:header="709" w:footer="709" w:gutter="0"/>

</xml_diff>